<commit_message>
Remove exposed API keys
</commit_message>
<xml_diff>
--- a/results/resumes/JobrightAi_Data_Analyst_New_York_Resume.docx
+++ b/results/resumes/JobrightAi_Data_Analyst_New_York_Resume.docx
@@ -1695,7 +1695,7 @@
           <w:sz w:val="20"/>
         </w:rPr>
         <w:br/>
-        <w:t>• Developed predictive models and performed exploratory data analysis (EDA) using Python and R to inform machine learning tuning strategies and AI agent performance evaluations.</w:t>
+        <w:t>• Integrated cloud-based data warehouses including Snowflake and BigQuery to centralize lending risk datasets, streamlining ETL pipeline performance by 20%.</w:t>
         <w:br/>
       </w:r>
     </w:p>
@@ -1706,7 +1706,7 @@
           <w:sz w:val="20"/>
         </w:rPr>
         <w:br/>
-        <w:t>• Engineered scalable data models and ETL pipelines in PostgreSQL to ensure high-quality data ingestion, directly supporting the foundation for AI-driven decision-making systems.</w:t>
+        <w:t>• Developed automated workflows for data ingestion into AWS S3, ensuring scalable storage and reliable access for predictive analytics and AI model tuning.</w:t>
         <w:br/>
       </w:r>
     </w:p>
@@ -1717,7 +1717,7 @@
           <w:sz w:val="20"/>
         </w:rPr>
         <w:br/>
-        <w:t>• Collaborated with product teams to interpret complex datasets, translating statistical findings into actionable narratives that enhanced AI model accuracy and stakeholder understanding.</w:t>
+        <w:t>• Collaborated with cross-functional product teams to design robust data models, ensuring high-quality input for AI-driven agent performance evaluations.</w:t>
         <w:br/>
       </w:r>
     </w:p>
@@ -1728,7 +1728,7 @@
           <w:sz w:val="20"/>
         </w:rPr>
         <w:br/>
-        <w:t>• Leveraged hands-on data modeling and statistical analysis to uncover usage trends, directly influencing the product roadmap for AI-driven career navigation tools.</w:t>
+        <w:t>• Leveraged CRM insights from Salesforce to enhance customer segmentation models, directly informing targeted marketing strategies and operational efficiency.</w:t>
         <w:br/>
       </w:r>
     </w:p>
@@ -1739,7 +1739,7 @@
           <w:sz w:val="20"/>
         </w:rPr>
         <w:br/>
-        <w:t>• Maintain full authorization to work in the United States and bring a strong track record of applying technical rigor to early-stage, fast-paced analytics environments.</w:t>
+        <w:t>• Drafted and maintained comprehensive SOPs for data quality monitoring, reducing manual debugging time by 30% and ensuring consistent, high-fidelity data for stakeholder reporting.</w:t>
         <w:br/>
       </w:r>
     </w:p>

</xml_diff>